<commit_message>
Update bakery checklist: add individual proprietor sections (J-P)
Added 7 new sections covering individual proprietor bakery acquisition:
financial/tax checks, new permit application process, recipe/skill transfer,
brand/customer succession, staffing, contract requirements, and
individual vs corporate comparison table.

https://claude.ai/code/session_01A9vChQCf26FV1PnWvvYt7x
</commit_message>
<xml_diff>
--- a/パン屋条件確認チェックリスト.docx
+++ b/パン屋条件確認チェックリスト.docx
@@ -1806,6 +1806,1418 @@
         <w:t>________________________________________________________________________________</w:t>
       </w:r>
     </w:p>
+    <w:p/>
+    <w:p>
+      <w:pPr>
+        <w:jc w:val="center"/>
+      </w:pPr>
+      <w:r>
+        <w:rPr>
+          <w:color w:val="1F497D"/>
+          <w:sz w:val="18"/>
+        </w:rPr>
+        <w:t>━━━━━━━━━━━━━━━━━━━━━━━━━━━━━━━━━━━━━━━━</w:t>
+      </w:r>
+    </w:p>
+    <w:p>
+      <w:pPr>
+        <w:pStyle w:val="Heading1"/>
+        <w:spacing w:before="120" w:after="80"/>
+      </w:pPr>
+      <w:r>
+        <w:rPr>
+          <w:color w:val="C00000"/>
+          <w:sz w:val="26"/>
+        </w:rPr>
+        <w:t>【追加】個人経営のパン屋の場合 — 追加確認項目</w:t>
+      </w:r>
+    </w:p>
+    <w:p>
+      <w:pPr>
+        <w:shd w:val="clear" w:color="auto" w:fill="FFF2CC"/>
+        <w:spacing w:before="80" w:after="120"/>
+        <w:ind w:left="170"/>
+      </w:pPr>
+      <w:r>
+        <w:rPr>
+          <w:color w:val="7F6000"/>
+          <w:sz w:val="19"/>
+        </w:rPr>
+        <w:t>※ 個人事業主のパン屋を取得・承継する場合は、法人経営と手続きが異なります。</w:t>
+        <w:br/>
+        <w:t xml:space="preserve">　 下記項目をA〜Iの確認事項に加えて必ずチェックしてください。</w:t>
+      </w:r>
+    </w:p>
+    <w:p>
+      <w:pPr>
+        <w:pStyle w:val="Heading2"/>
+        <w:shd w:val="clear" w:color="auto" w:fill="1F497D"/>
+        <w:spacing w:before="200" w:after="80"/>
+      </w:pPr>
+      <w:r>
+        <w:rPr>
+          <w:color w:val="FFFFFF"/>
+          <w:sz w:val="24"/>
+        </w:rPr>
+        <w:t>J. 財務・税務の確認（個人経営特有）</w:t>
+      </w:r>
+    </w:p>
+    <w:p>
+      <w:pPr>
+        <w:shd w:val="clear" w:color="auto" w:fill="E2EFDA"/>
+        <w:spacing w:before="80" w:after="120"/>
+        <w:ind w:left="170"/>
+      </w:pPr>
+      <w:r>
+        <w:rPr>
+          <w:color w:val="7F6000"/>
+          <w:sz w:val="19"/>
+        </w:rPr>
+        <w:t>個人事業主は決算書の代わりに確定申告書を使用。家計と事業が混在している場合があるため慎重に確認。</w:t>
+      </w:r>
+    </w:p>
+    <w:p>
+      <w:pPr>
+        <w:spacing w:after="40"/>
+        <w:ind w:left="283"/>
+      </w:pPr>
+      <w:r>
+        <w:rPr>
+          <w:color w:val="1F497D"/>
+          <w:sz w:val="22"/>
+        </w:rPr>
+        <w:t xml:space="preserve">☐  </w:t>
+      </w:r>
+      <w:r>
+        <w:rPr>
+          <w:sz w:val="21"/>
+        </w:rPr>
+        <w:t>確定申告書（直近2〜3年分）の開示を求める</w:t>
+      </w:r>
+    </w:p>
+    <w:p>
+      <w:pPr>
+        <w:spacing w:after="40"/>
+        <w:ind w:left="283"/>
+      </w:pPr>
+      <w:r>
+        <w:rPr>
+          <w:color w:val="1F497D"/>
+          <w:sz w:val="22"/>
+        </w:rPr>
+        <w:t xml:space="preserve">☐  </w:t>
+      </w:r>
+      <w:r>
+        <w:rPr>
+          <w:sz w:val="21"/>
+        </w:rPr>
+        <w:t>青色申告か白色申告かを確認（青色の方が収支が明確）</w:t>
+      </w:r>
+    </w:p>
+    <w:p>
+      <w:pPr>
+        <w:spacing w:after="40"/>
+        <w:ind w:left="283"/>
+      </w:pPr>
+      <w:r>
+        <w:rPr>
+          <w:color w:val="1F497D"/>
+          <w:sz w:val="22"/>
+        </w:rPr>
+        <w:t xml:space="preserve">☐  </w:t>
+      </w:r>
+      <w:r>
+        <w:rPr>
+          <w:sz w:val="21"/>
+        </w:rPr>
+        <w:t>売上・仕入・経費の実態が申告書から把握できるか</w:t>
+      </w:r>
+    </w:p>
+    <w:p>
+      <w:pPr>
+        <w:spacing w:after="40"/>
+        <w:ind w:left="283"/>
+      </w:pPr>
+      <w:r>
+        <w:rPr>
+          <w:color w:val="1F497D"/>
+          <w:sz w:val="22"/>
+        </w:rPr>
+        <w:t xml:space="preserve">☐  </w:t>
+      </w:r>
+      <w:r>
+        <w:rPr>
+          <w:sz w:val="21"/>
+        </w:rPr>
+        <w:t>事業用の銀行口座と個人口座が分離されているか</w:t>
+      </w:r>
+    </w:p>
+    <w:p>
+      <w:pPr>
+        <w:spacing w:after="40"/>
+        <w:ind w:left="283"/>
+      </w:pPr>
+      <w:r>
+        <w:rPr>
+          <w:color w:val="1F497D"/>
+          <w:sz w:val="22"/>
+        </w:rPr>
+        <w:t xml:space="preserve">☐  </w:t>
+      </w:r>
+      <w:r>
+        <w:rPr>
+          <w:sz w:val="21"/>
+        </w:rPr>
+        <w:t>未払いの所得税・住民税・消費税がないか</w:t>
+      </w:r>
+    </w:p>
+    <w:p>
+      <w:pPr>
+        <w:spacing w:after="40"/>
+        <w:ind w:left="283"/>
+      </w:pPr>
+      <w:r>
+        <w:rPr>
+          <w:color w:val="1F497D"/>
+          <w:sz w:val="22"/>
+        </w:rPr>
+        <w:t xml:space="preserve">☐  </w:t>
+      </w:r>
+      <w:r>
+        <w:rPr>
+          <w:sz w:val="21"/>
+        </w:rPr>
+        <w:t>国民健康保険・国民年金の未納がないか（事業承継後にトラブルになる場合あり）</w:t>
+      </w:r>
+    </w:p>
+    <w:p>
+      <w:pPr>
+        <w:spacing w:after="40"/>
+        <w:ind w:left="283"/>
+      </w:pPr>
+      <w:r>
+        <w:rPr>
+          <w:color w:val="1F497D"/>
+          <w:sz w:val="22"/>
+        </w:rPr>
+        <w:t xml:space="preserve">☐  </w:t>
+      </w:r>
+      <w:r>
+        <w:rPr>
+          <w:sz w:val="21"/>
+        </w:rPr>
+        <w:t>事業用資産（設備等）に対する減価償却の状況を確認</w:t>
+      </w:r>
+    </w:p>
+    <w:p>
+      <w:pPr>
+        <w:pStyle w:val="Heading2"/>
+        <w:shd w:val="clear" w:color="auto" w:fill="1F497D"/>
+        <w:spacing w:before="200" w:after="80"/>
+      </w:pPr>
+      <w:r>
+        <w:rPr>
+          <w:color w:val="FFFFFF"/>
+          <w:sz w:val="24"/>
+        </w:rPr>
+        <w:t>K. 許認可の新規申請対応（個人名義のため承継不可）</w:t>
+      </w:r>
+    </w:p>
+    <w:p>
+      <w:r>
+        <w:rPr>
+          <w:b/>
+          <w:color w:val="CC0000"/>
+          <w:sz w:val="18"/>
+        </w:rPr>
+        <w:t>★ 許可は個人名義のため引き継げない。新規申請が必須。</w:t>
+      </w:r>
+    </w:p>
+    <w:p>
+      <w:pPr>
+        <w:spacing w:before="120" w:after="40"/>
+      </w:pPr>
+      <w:r>
+        <w:rPr>
+          <w:b/>
+          <w:color w:val="1F497D"/>
+          <w:sz w:val="21"/>
+        </w:rPr>
+        <w:t>【事前確認】</w:t>
+      </w:r>
+    </w:p>
+    <w:p>
+      <w:pPr>
+        <w:spacing w:after="40"/>
+        <w:ind w:left="283"/>
+      </w:pPr>
+      <w:r>
+        <w:rPr>
+          <w:color w:val="1F497D"/>
+          <w:sz w:val="22"/>
+        </w:rPr>
+        <w:t xml:space="preserve">☐  </w:t>
+      </w:r>
+      <w:r>
+        <w:rPr>
+          <w:sz w:val="21"/>
+        </w:rPr>
+        <w:t>奥能登保健所（0768-22-2024）に事前相談の予約を入れる</w:t>
+      </w:r>
+    </w:p>
+    <w:p>
+      <w:pPr>
+        <w:spacing w:after="40"/>
+        <w:ind w:left="283"/>
+      </w:pPr>
+      <w:r>
+        <w:rPr>
+          <w:color w:val="1F497D"/>
+          <w:sz w:val="22"/>
+        </w:rPr>
+        <w:t xml:space="preserve">☐  </w:t>
+      </w:r>
+      <w:r>
+        <w:rPr>
+          <w:sz w:val="21"/>
+        </w:rPr>
+        <w:t>現在の厨房設備・レイアウトが新規許可の基準を満たすか確認する</w:t>
+      </w:r>
+    </w:p>
+    <w:p>
+      <w:pPr>
+        <w:spacing w:after="40"/>
+        <w:ind w:left="283"/>
+      </w:pPr>
+      <w:r>
+        <w:rPr>
+          <w:color w:val="1F497D"/>
+          <w:sz w:val="22"/>
+        </w:rPr>
+        <w:t xml:space="preserve">☐  </w:t>
+      </w:r>
+      <w:r>
+        <w:rPr>
+          <w:sz w:val="21"/>
+        </w:rPr>
+        <w:t>保健所が求める設備基準の確認（シンクの数・手洗い設備・換気・床壁材質等）</w:t>
+      </w:r>
+    </w:p>
+    <w:p>
+      <w:pPr>
+        <w:spacing w:after="40"/>
+        <w:ind w:left="283"/>
+      </w:pPr>
+      <w:r>
+        <w:rPr>
+          <w:color w:val="1F497D"/>
+          <w:sz w:val="22"/>
+        </w:rPr>
+        <w:t xml:space="preserve">☐  </w:t>
+      </w:r>
+      <w:r>
+        <w:rPr>
+          <w:sz w:val="21"/>
+        </w:rPr>
+        <w:t>改修が必要な箇所とその概算費用を把握する</w:t>
+      </w:r>
+    </w:p>
+    <w:p>
+      <w:pPr>
+        <w:spacing w:before="120" w:after="40"/>
+      </w:pPr>
+      <w:r>
+        <w:rPr>
+          <w:b/>
+          <w:color w:val="1F497D"/>
+          <w:sz w:val="21"/>
+        </w:rPr>
+        <w:t>【申請手続き】</w:t>
+      </w:r>
+    </w:p>
+    <w:p>
+      <w:pPr>
+        <w:spacing w:after="40"/>
+        <w:ind w:left="283"/>
+      </w:pPr>
+      <w:r>
+        <w:rPr>
+          <w:color w:val="1F497D"/>
+          <w:sz w:val="22"/>
+        </w:rPr>
+        <w:t xml:space="preserve">☐  </w:t>
+      </w:r>
+      <w:r>
+        <w:rPr>
+          <w:sz w:val="21"/>
+        </w:rPr>
+        <w:t>食品営業許可の申請種別を確認（菓子製造業 / パン製造業 / 飲食店営業等）</w:t>
+      </w:r>
+    </w:p>
+    <w:p>
+      <w:pPr>
+        <w:spacing w:after="40"/>
+        <w:ind w:left="283"/>
+      </w:pPr>
+      <w:r>
+        <w:rPr>
+          <w:color w:val="1F497D"/>
+          <w:sz w:val="22"/>
+        </w:rPr>
+        <w:t xml:space="preserve">☐  </w:t>
+      </w:r>
+      <w:r>
+        <w:rPr>
+          <w:sz w:val="21"/>
+        </w:rPr>
+        <w:t>食品衛生責任者の資格者を確保する（現オーナーから資格者を雇用 or 自分で取得）</w:t>
+      </w:r>
+    </w:p>
+    <w:p>
+      <w:pPr>
+        <w:spacing w:after="40"/>
+        <w:ind w:left="283"/>
+      </w:pPr>
+      <w:r>
+        <w:rPr>
+          <w:color w:val="1F497D"/>
+          <w:sz w:val="22"/>
+        </w:rPr>
+        <w:t xml:space="preserve">☐  </w:t>
+      </w:r>
+      <w:r>
+        <w:rPr>
+          <w:sz w:val="21"/>
+        </w:rPr>
+        <w:t>食品衛生責任者養成講習会の受講予約（約1日・受講料約1万円）</w:t>
+      </w:r>
+    </w:p>
+    <w:p>
+      <w:pPr>
+        <w:spacing w:after="40"/>
+        <w:ind w:left="283"/>
+      </w:pPr>
+      <w:r>
+        <w:rPr>
+          <w:color w:val="1F497D"/>
+          <w:sz w:val="22"/>
+        </w:rPr>
+        <w:t xml:space="preserve">☐  </w:t>
+      </w:r>
+      <w:r>
+        <w:rPr>
+          <w:sz w:val="21"/>
+        </w:rPr>
+        <w:t>申請から許可取得までの期間を確認（目安：2〜4週間）</w:t>
+      </w:r>
+    </w:p>
+    <w:p>
+      <w:pPr>
+        <w:spacing w:after="40"/>
+        <w:ind w:left="283"/>
+      </w:pPr>
+      <w:r>
+        <w:rPr>
+          <w:color w:val="1F497D"/>
+          <w:sz w:val="22"/>
+        </w:rPr>
+        <w:t xml:space="preserve">☐  </w:t>
+      </w:r>
+      <w:r>
+        <w:rPr>
+          <w:sz w:val="21"/>
+        </w:rPr>
+        <w:t>許可申請手数料を確認・準備（目安：1.5〜3万円）</w:t>
+      </w:r>
+    </w:p>
+    <w:p>
+      <w:pPr>
+        <w:spacing w:after="40"/>
+        <w:ind w:left="283"/>
+      </w:pPr>
+      <w:r>
+        <w:rPr>
+          <w:color w:val="1F497D"/>
+          <w:sz w:val="22"/>
+        </w:rPr>
+        <w:t xml:space="preserve">☐  </w:t>
+      </w:r>
+      <w:r>
+        <w:rPr>
+          <w:sz w:val="21"/>
+        </w:rPr>
+        <w:t>許可取得前に営業開始しないよう注意（無許可営業は食品衛生法違反）</w:t>
+      </w:r>
+    </w:p>
+    <w:p>
+      <w:pPr>
+        <w:pStyle w:val="Heading2"/>
+        <w:shd w:val="clear" w:color="auto" w:fill="1F497D"/>
+        <w:spacing w:before="200" w:after="80"/>
+      </w:pPr>
+      <w:r>
+        <w:rPr>
+          <w:color w:val="FFFFFF"/>
+          <w:sz w:val="24"/>
+        </w:rPr>
+        <w:t>L. レシピ・技術承継の確認</w:t>
+      </w:r>
+    </w:p>
+    <w:p>
+      <w:pPr>
+        <w:spacing w:after="40"/>
+        <w:ind w:left="283"/>
+      </w:pPr>
+      <w:r>
+        <w:rPr>
+          <w:color w:val="1F497D"/>
+          <w:sz w:val="22"/>
+        </w:rPr>
+        <w:t xml:space="preserve">☐  </w:t>
+      </w:r>
+      <w:r>
+        <w:rPr>
+          <w:sz w:val="21"/>
+        </w:rPr>
+        <w:t>レシピ・製法の引き継ぎを契約書に明記する合意を取る</w:t>
+      </w:r>
+    </w:p>
+    <w:p>
+      <w:pPr>
+        <w:spacing w:after="40"/>
+        <w:ind w:left="283"/>
+      </w:pPr>
+      <w:r>
+        <w:rPr>
+          <w:color w:val="1F497D"/>
+          <w:sz w:val="22"/>
+        </w:rPr>
+        <w:t xml:space="preserve">☐  </w:t>
+      </w:r>
+      <w:r>
+        <w:rPr>
+          <w:sz w:val="21"/>
+        </w:rPr>
+        <w:t>技術移転期間（一緒に働く期間）の条件を話し合う（目安：1〜3ヶ月）</w:t>
+      </w:r>
+    </w:p>
+    <w:p>
+      <w:pPr>
+        <w:spacing w:after="40"/>
+        <w:ind w:left="283"/>
+      </w:pPr>
+      <w:r>
+        <w:rPr>
+          <w:color w:val="1F497D"/>
+          <w:sz w:val="22"/>
+        </w:rPr>
+        <w:t xml:space="preserve">☐  </w:t>
+      </w:r>
+      <w:r>
+        <w:rPr>
+          <w:sz w:val="21"/>
+        </w:rPr>
+        <w:t>技術移転期間中の現オーナーへの謝礼・報酬条件を決める</w:t>
+      </w:r>
+    </w:p>
+    <w:p>
+      <w:pPr>
+        <w:spacing w:after="40"/>
+        <w:ind w:left="283"/>
+      </w:pPr>
+      <w:r>
+        <w:rPr>
+          <w:color w:val="1F497D"/>
+          <w:sz w:val="22"/>
+        </w:rPr>
+        <w:t xml:space="preserve">☐  </w:t>
+      </w:r>
+      <w:r>
+        <w:rPr>
+          <w:sz w:val="21"/>
+        </w:rPr>
+        <w:t>特定の仕入先（小麦粉・バター・酵母等）の銘柄・業者情報を書面で受け取る</w:t>
+      </w:r>
+    </w:p>
+    <w:p>
+      <w:pPr>
+        <w:spacing w:after="40"/>
+        <w:ind w:left="283"/>
+      </w:pPr>
+      <w:r>
+        <w:rPr>
+          <w:color w:val="1F497D"/>
+          <w:sz w:val="22"/>
+        </w:rPr>
+        <w:t xml:space="preserve">☐  </w:t>
+      </w:r>
+      <w:r>
+        <w:rPr>
+          <w:sz w:val="21"/>
+        </w:rPr>
+        <w:t>季節商品・定番商品のレシピリストを書面化してもらう</w:t>
+      </w:r>
+    </w:p>
+    <w:p>
+      <w:pPr>
+        <w:spacing w:after="40"/>
+        <w:ind w:left="283"/>
+      </w:pPr>
+      <w:r>
+        <w:rPr>
+          <w:color w:val="1F497D"/>
+          <w:sz w:val="22"/>
+        </w:rPr>
+        <w:t xml:space="preserve">☐  </w:t>
+      </w:r>
+      <w:r>
+        <w:rPr>
+          <w:sz w:val="21"/>
+        </w:rPr>
+        <w:t>パン製造の基礎技術（発酵管理・焼成温度等）を習得できる期間を確保する</w:t>
+      </w:r>
+    </w:p>
+    <w:p>
+      <w:pPr>
+        <w:spacing w:after="40"/>
+        <w:ind w:left="283"/>
+      </w:pPr>
+      <w:r>
+        <w:rPr>
+          <w:color w:val="1F497D"/>
+          <w:sz w:val="22"/>
+        </w:rPr>
+        <w:t xml:space="preserve">☐  </w:t>
+      </w:r>
+      <w:r>
+        <w:rPr>
+          <w:sz w:val="21"/>
+        </w:rPr>
+        <w:t>現オーナーが競業避止義務（近隣で同業を再開しない）に同意するか確認</w:t>
+      </w:r>
+    </w:p>
+    <w:p>
+      <w:pPr>
+        <w:pStyle w:val="Heading2"/>
+        <w:shd w:val="clear" w:color="auto" w:fill="1F497D"/>
+        <w:spacing w:before="200" w:after="80"/>
+      </w:pPr>
+      <w:r>
+        <w:rPr>
+          <w:color w:val="FFFFFF"/>
+          <w:sz w:val="24"/>
+        </w:rPr>
+        <w:t>M. 屋号・顧客の承継</w:t>
+      </w:r>
+    </w:p>
+    <w:p>
+      <w:pPr>
+        <w:spacing w:after="40"/>
+        <w:ind w:left="283"/>
+      </w:pPr>
+      <w:r>
+        <w:rPr>
+          <w:color w:val="1F497D"/>
+          <w:sz w:val="22"/>
+        </w:rPr>
+        <w:t xml:space="preserve">☐  </w:t>
+      </w:r>
+      <w:r>
+        <w:rPr>
+          <w:sz w:val="21"/>
+        </w:rPr>
+        <w:t>屋号を引き継ぐか・新しいブランド名（能登バーガー関連）にするかを決める</w:t>
+      </w:r>
+    </w:p>
+    <w:p>
+      <w:pPr>
+        <w:spacing w:after="40"/>
+        <w:ind w:left="283"/>
+      </w:pPr>
+      <w:r>
+        <w:rPr>
+          <w:color w:val="1F497D"/>
+          <w:sz w:val="22"/>
+        </w:rPr>
+        <w:t xml:space="preserve">☐  </w:t>
+      </w:r>
+      <w:r>
+        <w:rPr>
+          <w:sz w:val="21"/>
+        </w:rPr>
+        <w:t>屋号を引き継ぐ場合、現オーナーが商標登録していないかを確認</w:t>
+      </w:r>
+    </w:p>
+    <w:p>
+      <w:pPr>
+        <w:spacing w:after="40"/>
+        <w:ind w:left="283"/>
+      </w:pPr>
+      <w:r>
+        <w:rPr>
+          <w:color w:val="1F497D"/>
+          <w:sz w:val="22"/>
+        </w:rPr>
+        <w:t xml:space="preserve">☐  </w:t>
+      </w:r>
+      <w:r>
+        <w:rPr>
+          <w:sz w:val="21"/>
+        </w:rPr>
+        <w:t>既存顧客リスト（電話・住所等）の提供を受けられるか</w:t>
+      </w:r>
+    </w:p>
+    <w:p>
+      <w:pPr>
+        <w:spacing w:after="40"/>
+        <w:ind w:left="283"/>
+      </w:pPr>
+      <w:r>
+        <w:rPr>
+          <w:color w:val="1F497D"/>
+          <w:sz w:val="22"/>
+        </w:rPr>
+        <w:t xml:space="preserve">☐  </w:t>
+      </w:r>
+      <w:r>
+        <w:rPr>
+          <w:sz w:val="21"/>
+        </w:rPr>
+        <w:t>取引先飲食店・学校・施設への引き継ぎ挨拶を現オーナーと一緒に行えるか</w:t>
+      </w:r>
+    </w:p>
+    <w:p>
+      <w:pPr>
+        <w:spacing w:after="40"/>
+        <w:ind w:left="283"/>
+      </w:pPr>
+      <w:r>
+        <w:rPr>
+          <w:color w:val="1F497D"/>
+          <w:sz w:val="22"/>
+        </w:rPr>
+        <w:t xml:space="preserve">☐  </w:t>
+      </w:r>
+      <w:r>
+        <w:rPr>
+          <w:sz w:val="21"/>
+        </w:rPr>
+        <w:t>SNS・Googleマップ等のアカウント・口コミ情報を引き継げるか</w:t>
+      </w:r>
+    </w:p>
+    <w:p>
+      <w:pPr>
+        <w:spacing w:after="40"/>
+        <w:ind w:left="283"/>
+      </w:pPr>
+      <w:r>
+        <w:rPr>
+          <w:color w:val="1F497D"/>
+          <w:sz w:val="22"/>
+        </w:rPr>
+        <w:t xml:space="preserve">☐  </w:t>
+      </w:r>
+      <w:r>
+        <w:rPr>
+          <w:sz w:val="21"/>
+        </w:rPr>
+        <w:t>地域の祭り・イベント等での出店実績・人脈を紹介してもらえるか</w:t>
+      </w:r>
+    </w:p>
+    <w:p>
+      <w:pPr>
+        <w:pStyle w:val="Heading2"/>
+        <w:shd w:val="clear" w:color="auto" w:fill="1F497D"/>
+        <w:spacing w:before="200" w:after="80"/>
+      </w:pPr>
+      <w:r>
+        <w:rPr>
+          <w:color w:val="FFFFFF"/>
+          <w:sz w:val="24"/>
+        </w:rPr>
+        <w:t>N. 雇用・人材の確認</w:t>
+      </w:r>
+    </w:p>
+    <w:p>
+      <w:pPr>
+        <w:spacing w:after="40"/>
+        <w:ind w:left="283"/>
+      </w:pPr>
+      <w:r>
+        <w:rPr>
+          <w:color w:val="1F497D"/>
+          <w:sz w:val="22"/>
+        </w:rPr>
+        <w:t xml:space="preserve">☐  </w:t>
+      </w:r>
+      <w:r>
+        <w:rPr>
+          <w:sz w:val="21"/>
+        </w:rPr>
+        <w:t>現在のスタッフ・パートの有無と人数</w:t>
+      </w:r>
+    </w:p>
+    <w:p>
+      <w:pPr>
+        <w:spacing w:after="40"/>
+        <w:ind w:left="283"/>
+      </w:pPr>
+      <w:r>
+        <w:rPr>
+          <w:color w:val="1F497D"/>
+          <w:sz w:val="22"/>
+        </w:rPr>
+        <w:t xml:space="preserve">☐  </w:t>
+      </w:r>
+      <w:r>
+        <w:rPr>
+          <w:sz w:val="21"/>
+        </w:rPr>
+        <w:t>スタッフを引き続き雇用する必要があるか（事実上の引き継ぎ義務の有無）</w:t>
+      </w:r>
+    </w:p>
+    <w:p>
+      <w:pPr>
+        <w:spacing w:after="40"/>
+        <w:ind w:left="283"/>
+      </w:pPr>
+      <w:r>
+        <w:rPr>
+          <w:color w:val="1F497D"/>
+          <w:sz w:val="22"/>
+        </w:rPr>
+        <w:t xml:space="preserve">☐  </w:t>
+      </w:r>
+      <w:r>
+        <w:rPr>
+          <w:sz w:val="21"/>
+        </w:rPr>
+        <w:t>引き継ぐ場合、現在の雇用条件（時給・シフト等）を確認</w:t>
+      </w:r>
+    </w:p>
+    <w:p>
+      <w:pPr>
+        <w:spacing w:after="40"/>
+        <w:ind w:left="283"/>
+      </w:pPr>
+      <w:r>
+        <w:rPr>
+          <w:color w:val="1F497D"/>
+          <w:sz w:val="22"/>
+        </w:rPr>
+        <w:t xml:space="preserve">☐  </w:t>
+      </w:r>
+      <w:r>
+        <w:rPr>
+          <w:sz w:val="21"/>
+        </w:rPr>
+        <w:t>現オーナー自身がパン製造の主力の場合、後継者（職人）をどう確保するか計画する</w:t>
+      </w:r>
+    </w:p>
+    <w:p>
+      <w:pPr>
+        <w:spacing w:after="40"/>
+        <w:ind w:left="283"/>
+      </w:pPr>
+      <w:r>
+        <w:rPr>
+          <w:color w:val="1F497D"/>
+          <w:sz w:val="22"/>
+        </w:rPr>
+        <w:t xml:space="preserve">☐  </w:t>
+      </w:r>
+      <w:r>
+        <w:rPr>
+          <w:sz w:val="21"/>
+        </w:rPr>
+        <w:t>能登高校生・地域おこし協力隊との連携でスタッフを確保できるか検討</w:t>
+      </w:r>
+    </w:p>
+    <w:p>
+      <w:pPr>
+        <w:pStyle w:val="Heading2"/>
+        <w:shd w:val="clear" w:color="auto" w:fill="1F497D"/>
+        <w:spacing w:before="200" w:after="80"/>
+      </w:pPr>
+      <w:r>
+        <w:rPr>
+          <w:color w:val="FFFFFF"/>
+          <w:sz w:val="24"/>
+        </w:rPr>
+        <w:t>O. 個人経営承継時の契約書 必須記載事項</w:t>
+      </w:r>
+    </w:p>
+    <w:p>
+      <w:pPr>
+        <w:shd w:val="clear" w:color="auto" w:fill="FCE4D6"/>
+        <w:spacing w:before="80" w:after="120"/>
+        <w:ind w:left="170"/>
+      </w:pPr>
+      <w:r>
+        <w:rPr>
+          <w:color w:val="7F6000"/>
+          <w:sz w:val="19"/>
+        </w:rPr>
+        <w:t>個人事業の承継は口約束になりやすい。必ず書面化すること。弁護士・司法書士への相談を推奨。</w:t>
+      </w:r>
+    </w:p>
+    <w:p>
+      <w:pPr>
+        <w:spacing w:after="40"/>
+        <w:ind w:left="283"/>
+      </w:pPr>
+      <w:r>
+        <w:rPr>
+          <w:color w:val="1F497D"/>
+          <w:sz w:val="22"/>
+        </w:rPr>
+        <w:t xml:space="preserve">☐  </w:t>
+      </w:r>
+      <w:r>
+        <w:rPr>
+          <w:sz w:val="21"/>
+        </w:rPr>
+        <w:t>譲渡対象物の明細（設備リスト・在庫・屋号・顧客リスト等）</w:t>
+      </w:r>
+    </w:p>
+    <w:p>
+      <w:pPr>
+        <w:spacing w:after="40"/>
+        <w:ind w:left="283"/>
+      </w:pPr>
+      <w:r>
+        <w:rPr>
+          <w:color w:val="1F497D"/>
+          <w:sz w:val="22"/>
+        </w:rPr>
+        <w:t xml:space="preserve">☐  </w:t>
+      </w:r>
+      <w:r>
+        <w:rPr>
+          <w:sz w:val="21"/>
+        </w:rPr>
+        <w:t>譲渡価格・支払い条件（一括 or 分割）</w:t>
+      </w:r>
+    </w:p>
+    <w:p>
+      <w:pPr>
+        <w:spacing w:after="40"/>
+        <w:ind w:left="283"/>
+      </w:pPr>
+      <w:r>
+        <w:rPr>
+          <w:color w:val="1F497D"/>
+          <w:sz w:val="22"/>
+        </w:rPr>
+        <w:t xml:space="preserve">☐  </w:t>
+      </w:r>
+      <w:r>
+        <w:rPr>
+          <w:sz w:val="21"/>
+        </w:rPr>
+        <w:t>レシピ・ノウハウの引き継ぎ範囲と技術移転期間</w:t>
+      </w:r>
+    </w:p>
+    <w:p>
+      <w:pPr>
+        <w:spacing w:after="40"/>
+        <w:ind w:left="283"/>
+      </w:pPr>
+      <w:r>
+        <w:rPr>
+          <w:color w:val="1F497D"/>
+          <w:sz w:val="22"/>
+        </w:rPr>
+        <w:t xml:space="preserve">☐  </w:t>
+      </w:r>
+      <w:r>
+        <w:rPr>
+          <w:sz w:val="21"/>
+        </w:rPr>
+        <w:t>許認可の新規申請に協力する義務（現オーナーの協力条項）</w:t>
+      </w:r>
+    </w:p>
+    <w:p>
+      <w:pPr>
+        <w:spacing w:after="40"/>
+        <w:ind w:left="283"/>
+      </w:pPr>
+      <w:r>
+        <w:rPr>
+          <w:color w:val="1F497D"/>
+          <w:sz w:val="22"/>
+        </w:rPr>
+        <w:t xml:space="preserve">☐  </w:t>
+      </w:r>
+      <w:r>
+        <w:rPr>
+          <w:sz w:val="21"/>
+        </w:rPr>
+        <w:t>競業避止義務（〇年間・〇km以内で同業開業禁止等）</w:t>
+      </w:r>
+    </w:p>
+    <w:p>
+      <w:pPr>
+        <w:spacing w:after="40"/>
+        <w:ind w:left="283"/>
+      </w:pPr>
+      <w:r>
+        <w:rPr>
+          <w:color w:val="1F497D"/>
+          <w:sz w:val="22"/>
+        </w:rPr>
+        <w:t xml:space="preserve">☐  </w:t>
+      </w:r>
+      <w:r>
+        <w:rPr>
+          <w:sz w:val="21"/>
+        </w:rPr>
+        <w:t>設備の瑕疵担保責任（引き渡し後に設備が壊れた場合の責任の所在）</w:t>
+      </w:r>
+    </w:p>
+    <w:p>
+      <w:pPr>
+        <w:spacing w:after="40"/>
+        <w:ind w:left="283"/>
+      </w:pPr>
+      <w:r>
+        <w:rPr>
+          <w:color w:val="1F497D"/>
+          <w:sz w:val="22"/>
+        </w:rPr>
+        <w:t xml:space="preserve">☐  </w:t>
+      </w:r>
+      <w:r>
+        <w:rPr>
+          <w:sz w:val="21"/>
+        </w:rPr>
+        <w:t>引き渡し日・鍵の受け渡し条件</w:t>
+      </w:r>
+    </w:p>
+    <w:p>
+      <w:pPr>
+        <w:spacing w:after="40"/>
+        <w:ind w:left="283"/>
+      </w:pPr>
+      <w:r>
+        <w:rPr>
+          <w:color w:val="1F497D"/>
+          <w:sz w:val="22"/>
+        </w:rPr>
+        <w:t xml:space="preserve">☐  </w:t>
+      </w:r>
+      <w:r>
+        <w:rPr>
+          <w:sz w:val="21"/>
+        </w:rPr>
+        <w:t>契約解除条件（許可が取得できなかった場合等）</w:t>
+      </w:r>
+    </w:p>
+    <w:p/>
+    <w:p>
+      <w:pPr>
+        <w:pStyle w:val="Heading2"/>
+        <w:shd w:val="clear" w:color="auto" w:fill="1F497D"/>
+        <w:spacing w:before="200" w:after="80"/>
+      </w:pPr>
+      <w:r>
+        <w:rPr>
+          <w:color w:val="FFFFFF"/>
+          <w:sz w:val="24"/>
+        </w:rPr>
+        <w:t>P. 個人経営 vs 法人経営 — 承継手続き比較表</w:t>
+      </w:r>
+    </w:p>
+    <w:tbl>
+      <w:tblPr>
+        <w:tblStyle w:val="TableGrid"/>
+        <w:tblW w:type="auto" w:w="0"/>
+        <w:tblLook w:firstColumn="1" w:firstRow="1" w:lastColumn="0" w:lastRow="0" w:noHBand="0" w:noVBand="1" w:val="04A0"/>
+      </w:tblPr>
+      <w:tblGrid>
+        <w:gridCol w:w="3135"/>
+        <w:gridCol w:w="3135"/>
+        <w:gridCol w:w="3135"/>
+      </w:tblGrid>
+      <w:tr>
+        <w:tc>
+          <w:tcPr>
+            <w:tcW w:type="dxa" w:w="3135"/>
+            <w:shd w:val="clear" w:color="auto" w:fill="1F497D"/>
+          </w:tcPr>
+          <w:p>
+            <w:r>
+              <w:rPr>
+                <w:b/>
+                <w:color w:val="FFFFFF"/>
+                <w:sz w:val="19"/>
+              </w:rPr>
+              <w:t>確認項目</w:t>
+            </w:r>
+          </w:p>
+        </w:tc>
+        <w:tc>
+          <w:tcPr>
+            <w:tcW w:type="dxa" w:w="3135"/>
+            <w:shd w:val="clear" w:color="auto" w:fill="1F497D"/>
+          </w:tcPr>
+          <w:p>
+            <w:r>
+              <w:rPr>
+                <w:b/>
+                <w:color w:val="FFFFFF"/>
+                <w:sz w:val="19"/>
+              </w:rPr>
+              <w:t>個人経営（個人事業主）</w:t>
+            </w:r>
+          </w:p>
+        </w:tc>
+        <w:tc>
+          <w:tcPr>
+            <w:tcW w:type="dxa" w:w="3135"/>
+            <w:shd w:val="clear" w:color="auto" w:fill="1F497D"/>
+          </w:tcPr>
+          <w:p>
+            <w:r>
+              <w:rPr>
+                <w:b/>
+                <w:color w:val="FFFFFF"/>
+                <w:sz w:val="19"/>
+              </w:rPr>
+              <w:t>法人経営（株式会社等）</w:t>
+            </w:r>
+          </w:p>
+        </w:tc>
+      </w:tr>
+      <w:tr>
+        <w:tc>
+          <w:tcPr>
+            <w:tcW w:type="dxa" w:w="3135"/>
+          </w:tcPr>
+          <w:p>
+            <w:r>
+              <w:rPr>
+                <w:sz w:val="18"/>
+              </w:rPr>
+              <w:t>譲渡手続き</w:t>
+            </w:r>
+          </w:p>
+        </w:tc>
+        <w:tc>
+          <w:tcPr>
+            <w:tcW w:type="dxa" w:w="3135"/>
+          </w:tcPr>
+          <w:p>
+            <w:r>
+              <w:rPr>
+                <w:sz w:val="18"/>
+              </w:rPr>
+              <w:t>設備売買契約のみ</w:t>
+            </w:r>
+          </w:p>
+        </w:tc>
+        <w:tc>
+          <w:tcPr>
+            <w:tcW w:type="dxa" w:w="3135"/>
+          </w:tcPr>
+          <w:p>
+            <w:r>
+              <w:rPr>
+                <w:sz w:val="18"/>
+              </w:rPr>
+              <w:t>株式・持分の移転＋登記変更</w:t>
+            </w:r>
+          </w:p>
+        </w:tc>
+      </w:tr>
+      <w:tr>
+        <w:tc>
+          <w:tcPr>
+            <w:tcW w:type="dxa" w:w="3135"/>
+          </w:tcPr>
+          <w:p>
+            <w:r>
+              <w:rPr>
+                <w:sz w:val="18"/>
+              </w:rPr>
+              <w:t>食品営業許可</w:t>
+            </w:r>
+          </w:p>
+        </w:tc>
+        <w:tc>
+          <w:tcPr>
+            <w:tcW w:type="dxa" w:w="3135"/>
+          </w:tcPr>
+          <w:p>
+            <w:r>
+              <w:rPr>
+                <w:sz w:val="18"/>
+              </w:rPr>
+              <w:t>新規申請が必須</w:t>
+            </w:r>
+          </w:p>
+        </w:tc>
+        <w:tc>
+          <w:tcPr>
+            <w:tcW w:type="dxa" w:w="3135"/>
+          </w:tcPr>
+          <w:p>
+            <w:r>
+              <w:rPr>
+                <w:sz w:val="18"/>
+              </w:rPr>
+              <w:t>名義変更で承継できる場合あり</w:t>
+            </w:r>
+          </w:p>
+        </w:tc>
+      </w:tr>
+      <w:tr>
+        <w:tc>
+          <w:tcPr>
+            <w:tcW w:type="dxa" w:w="3135"/>
+          </w:tcPr>
+          <w:p>
+            <w:r>
+              <w:rPr>
+                <w:sz w:val="18"/>
+              </w:rPr>
+              <w:t>価格</w:t>
+            </w:r>
+          </w:p>
+        </w:tc>
+        <w:tc>
+          <w:tcPr>
+            <w:tcW w:type="dxa" w:w="3135"/>
+          </w:tcPr>
+          <w:p>
+            <w:r>
+              <w:rPr>
+                <w:sz w:val="18"/>
+              </w:rPr>
+              <w:t>比較的低い傾向</w:t>
+            </w:r>
+          </w:p>
+        </w:tc>
+        <w:tc>
+          <w:tcPr>
+            <w:tcW w:type="dxa" w:w="3135"/>
+          </w:tcPr>
+          <w:p>
+            <w:r>
+              <w:rPr>
+                <w:sz w:val="18"/>
+              </w:rPr>
+              <w:t>営業権・株式評価が加わる</w:t>
+            </w:r>
+          </w:p>
+        </w:tc>
+      </w:tr>
+      <w:tr>
+        <w:tc>
+          <w:tcPr>
+            <w:tcW w:type="dxa" w:w="3135"/>
+          </w:tcPr>
+          <w:p>
+            <w:r>
+              <w:rPr>
+                <w:sz w:val="18"/>
+              </w:rPr>
+              <w:t>財務の透明性</w:t>
+            </w:r>
+          </w:p>
+        </w:tc>
+        <w:tc>
+          <w:tcPr>
+            <w:tcW w:type="dxa" w:w="3135"/>
+          </w:tcPr>
+          <w:p>
+            <w:r>
+              <w:rPr>
+                <w:sz w:val="18"/>
+              </w:rPr>
+              <w:t>確定申告書のみ（把握しにくい）</w:t>
+            </w:r>
+          </w:p>
+        </w:tc>
+        <w:tc>
+          <w:tcPr>
+            <w:tcW w:type="dxa" w:w="3135"/>
+          </w:tcPr>
+          <w:p>
+            <w:r>
+              <w:rPr>
+                <w:sz w:val="18"/>
+              </w:rPr>
+              <w:t>決算書あり（把握しやすい）</w:t>
+            </w:r>
+          </w:p>
+        </w:tc>
+      </w:tr>
+      <w:tr>
+        <w:tc>
+          <w:tcPr>
+            <w:tcW w:type="dxa" w:w="3135"/>
+          </w:tcPr>
+          <w:p>
+            <w:r>
+              <w:rPr>
+                <w:sz w:val="18"/>
+              </w:rPr>
+              <w:t>手続き期間</w:t>
+            </w:r>
+          </w:p>
+        </w:tc>
+        <w:tc>
+          <w:tcPr>
+            <w:tcW w:type="dxa" w:w="3135"/>
+          </w:tcPr>
+          <w:p>
+            <w:r>
+              <w:rPr>
+                <w:sz w:val="18"/>
+              </w:rPr>
+              <w:t>短い（数週間〜1ヶ月）</w:t>
+            </w:r>
+          </w:p>
+        </w:tc>
+        <w:tc>
+          <w:tcPr>
+            <w:tcW w:type="dxa" w:w="3135"/>
+          </w:tcPr>
+          <w:p>
+            <w:r>
+              <w:rPr>
+                <w:sz w:val="18"/>
+              </w:rPr>
+              <w:t>長い（1〜3ヶ月）</w:t>
+            </w:r>
+          </w:p>
+        </w:tc>
+      </w:tr>
+      <w:tr>
+        <w:tc>
+          <w:tcPr>
+            <w:tcW w:type="dxa" w:w="3135"/>
+          </w:tcPr>
+          <w:p>
+            <w:r>
+              <w:rPr>
+                <w:sz w:val="18"/>
+              </w:rPr>
+              <w:t>雇用承継</w:t>
+            </w:r>
+          </w:p>
+        </w:tc>
+        <w:tc>
+          <w:tcPr>
+            <w:tcW w:type="dxa" w:w="3135"/>
+          </w:tcPr>
+          <w:p>
+            <w:r>
+              <w:rPr>
+                <w:sz w:val="18"/>
+              </w:rPr>
+              <w:t>任意（新規雇用契約）</w:t>
+            </w:r>
+          </w:p>
+        </w:tc>
+        <w:tc>
+          <w:tcPr>
+            <w:tcW w:type="dxa" w:w="3135"/>
+          </w:tcPr>
+          <w:p>
+            <w:r>
+              <w:rPr>
+                <w:sz w:val="18"/>
+              </w:rPr>
+              <w:t>自動承継の場合あり</w:t>
+            </w:r>
+          </w:p>
+        </w:tc>
+      </w:tr>
+      <w:tr>
+        <w:tc>
+          <w:tcPr>
+            <w:tcW w:type="dxa" w:w="3135"/>
+          </w:tcPr>
+          <w:p>
+            <w:r>
+              <w:rPr>
+                <w:sz w:val="18"/>
+              </w:rPr>
+              <w:t>補助金適用</w:t>
+            </w:r>
+          </w:p>
+        </w:tc>
+        <w:tc>
+          <w:tcPr>
+            <w:tcW w:type="dxa" w:w="3135"/>
+          </w:tcPr>
+          <w:p>
+            <w:r>
+              <w:rPr>
+                <w:sz w:val="18"/>
+              </w:rPr>
+              <w:t>取得側（金丸商店）が申請→問題なし</w:t>
+            </w:r>
+          </w:p>
+        </w:tc>
+        <w:tc>
+          <w:tcPr>
+            <w:tcW w:type="dxa" w:w="3135"/>
+          </w:tcPr>
+          <w:p>
+            <w:r>
+              <w:rPr>
+                <w:sz w:val="18"/>
+              </w:rPr>
+              <w:t>同左</w:t>
+            </w:r>
+          </w:p>
+        </w:tc>
+      </w:tr>
+      <w:tr>
+        <w:tc>
+          <w:tcPr>
+            <w:tcW w:type="dxa" w:w="3135"/>
+          </w:tcPr>
+          <w:p>
+            <w:r>
+              <w:rPr>
+                <w:sz w:val="18"/>
+              </w:rPr>
+              <w:t>リスク</w:t>
+            </w:r>
+          </w:p>
+        </w:tc>
+        <w:tc>
+          <w:tcPr>
+            <w:tcW w:type="dxa" w:w="3135"/>
+          </w:tcPr>
+          <w:p>
+            <w:r>
+              <w:rPr>
+                <w:sz w:val="18"/>
+              </w:rPr>
+              <w:t>許可取得できない場合の損失</w:t>
+            </w:r>
+          </w:p>
+        </w:tc>
+        <w:tc>
+          <w:tcPr>
+            <w:tcW w:type="dxa" w:w="3135"/>
+          </w:tcPr>
+          <w:p>
+            <w:r>
+              <w:rPr>
+                <w:sz w:val="18"/>
+              </w:rPr>
+              <w:t>簿外債務・未払い税金の承継リスク</w:t>
+            </w:r>
+          </w:p>
+        </w:tc>
+      </w:tr>
+    </w:tbl>
     <w:sectPr>
       <w:footerReference w:type="default" r:id="rId9"/>
       <w:pgSz w:w="12240" w:h="15840"/>

</xml_diff>